<commit_message>
Set readable endpoint table widths in report
</commit_message>
<xml_diff>
--- a/Lab5-Report.docx
+++ b/Lab5-Report.docx
@@ -36,17 +36,18 @@
       <w:tblPr>
         <w:tblStyle w:val="LightShading-Accent1"/>
         <w:tblW w:type="auto" w:w="0"/>
+        <w:tblLayout w:type="fixed"/>
         <w:tblLook w:firstColumn="1" w:firstRow="1" w:lastColumn="0" w:lastRow="0" w:noHBand="0" w:noVBand="1" w:val="04A0"/>
       </w:tblPr>
       <w:tblGrid>
-        <w:gridCol w:w="2880"/>
-        <w:gridCol w:w="2880"/>
-        <w:gridCol w:w="2880"/>
+        <w:gridCol w:w="1152"/>
+        <w:gridCol w:w="5328"/>
+        <w:gridCol w:w="2448"/>
       </w:tblGrid>
       <w:tr>
         <w:tc>
           <w:tcPr>
-            <w:tcW w:type="dxa" w:w="2880"/>
+            <w:tcW w:type="dxa" w:w="1152"/>
           </w:tcPr>
           <w:p>
             <w:r>
@@ -56,7 +57,7 @@
         </w:tc>
         <w:tc>
           <w:tcPr>
-            <w:tcW w:type="dxa" w:w="2880"/>
+            <w:tcW w:type="dxa" w:w="5328"/>
           </w:tcPr>
           <w:p>
             <w:r>
@@ -66,7 +67,7 @@
         </w:tc>
         <w:tc>
           <w:tcPr>
-            <w:tcW w:type="dxa" w:w="2880"/>
+            <w:tcW w:type="dxa" w:w="2448"/>
           </w:tcPr>
           <w:p>
             <w:r>
@@ -78,7 +79,7 @@
       <w:tr>
         <w:tc>
           <w:tcPr>
-            <w:tcW w:type="dxa" w:w="2880"/>
+            <w:tcW w:type="dxa" w:w="1152"/>
           </w:tcPr>
           <w:p>
             <w:r>
@@ -88,7 +89,7 @@
         </w:tc>
         <w:tc>
           <w:tcPr>
-            <w:tcW w:type="dxa" w:w="2880"/>
+            <w:tcW w:type="dxa" w:w="5328"/>
           </w:tcPr>
           <w:p>
             <w:r>
@@ -98,7 +99,7 @@
         </w:tc>
         <w:tc>
           <w:tcPr>
-            <w:tcW w:type="dxa" w:w="2880"/>
+            <w:tcW w:type="dxa" w:w="2448"/>
           </w:tcPr>
           <w:p>
             <w:r>
@@ -110,7 +111,7 @@
       <w:tr>
         <w:tc>
           <w:tcPr>
-            <w:tcW w:type="dxa" w:w="2880"/>
+            <w:tcW w:type="dxa" w:w="1152"/>
           </w:tcPr>
           <w:p>
             <w:r>
@@ -120,7 +121,7 @@
         </w:tc>
         <w:tc>
           <w:tcPr>
-            <w:tcW w:type="dxa" w:w="2880"/>
+            <w:tcW w:type="dxa" w:w="5328"/>
           </w:tcPr>
           <w:p>
             <w:r>
@@ -130,7 +131,7 @@
         </w:tc>
         <w:tc>
           <w:tcPr>
-            <w:tcW w:type="dxa" w:w="2880"/>
+            <w:tcW w:type="dxa" w:w="2448"/>
           </w:tcPr>
           <w:p>
             <w:r>
@@ -142,7 +143,7 @@
       <w:tr>
         <w:tc>
           <w:tcPr>
-            <w:tcW w:type="dxa" w:w="2880"/>
+            <w:tcW w:type="dxa" w:w="1152"/>
           </w:tcPr>
           <w:p>
             <w:r>
@@ -152,7 +153,7 @@
         </w:tc>
         <w:tc>
           <w:tcPr>
-            <w:tcW w:type="dxa" w:w="2880"/>
+            <w:tcW w:type="dxa" w:w="5328"/>
           </w:tcPr>
           <w:p>
             <w:r>
@@ -162,7 +163,7 @@
         </w:tc>
         <w:tc>
           <w:tcPr>
-            <w:tcW w:type="dxa" w:w="2880"/>
+            <w:tcW w:type="dxa" w:w="2448"/>
           </w:tcPr>
           <w:p>
             <w:r>
@@ -174,7 +175,7 @@
       <w:tr>
         <w:tc>
           <w:tcPr>
-            <w:tcW w:type="dxa" w:w="2880"/>
+            <w:tcW w:type="dxa" w:w="1152"/>
           </w:tcPr>
           <w:p>
             <w:r>
@@ -184,7 +185,7 @@
         </w:tc>
         <w:tc>
           <w:tcPr>
-            <w:tcW w:type="dxa" w:w="2880"/>
+            <w:tcW w:type="dxa" w:w="5328"/>
           </w:tcPr>
           <w:p>
             <w:r>
@@ -194,7 +195,7 @@
         </w:tc>
         <w:tc>
           <w:tcPr>
-            <w:tcW w:type="dxa" w:w="2880"/>
+            <w:tcW w:type="dxa" w:w="2448"/>
           </w:tcPr>
           <w:p>
             <w:r>
@@ -206,7 +207,7 @@
       <w:tr>
         <w:tc>
           <w:tcPr>
-            <w:tcW w:type="dxa" w:w="2880"/>
+            <w:tcW w:type="dxa" w:w="1152"/>
           </w:tcPr>
           <w:p>
             <w:r>
@@ -216,7 +217,7 @@
         </w:tc>
         <w:tc>
           <w:tcPr>
-            <w:tcW w:type="dxa" w:w="2880"/>
+            <w:tcW w:type="dxa" w:w="5328"/>
           </w:tcPr>
           <w:p>
             <w:r>
@@ -226,7 +227,7 @@
         </w:tc>
         <w:tc>
           <w:tcPr>
-            <w:tcW w:type="dxa" w:w="2880"/>
+            <w:tcW w:type="dxa" w:w="2448"/>
           </w:tcPr>
           <w:p>
             <w:r>

</xml_diff>